<commit_message>
preblem set upc 2026
</commit_message>
<xml_diff>
--- a/problems/UPC 2026/A.docx
+++ b/problems/UPC 2026/A.docx
@@ -32,7 +32,7 @@
           <w:sz w:val="44"/>
           <w:szCs w:val="44"/>
         </w:rPr>
-        <w:t>Saúl</w:t>
+        <w:t>El profesor Bit</w:t>
       </w:r>
       <w:r>
         <w:rPr>
@@ -100,14 +100,86 @@
     </w:p>
     <w:p>
       <w:pPr>
-        <w:pStyle w:val="Sinespaciado"/>
-        <w:jc w:val="center"/>
-        <w:rPr>
-          <w:rFonts w:ascii="Times New Roman" w:hAnsi="Times New Roman" w:cs="Times New Roman"/>
-          <w:sz w:val="20"/>
-          <w:szCs w:val="20"/>
-        </w:rPr>
-      </w:pPr>
+        <w:pStyle w:val="NormalWeb"/>
+        <w:rPr>
+          <w:sz w:val="20"/>
+          <w:szCs w:val="20"/>
+        </w:rPr>
+      </w:pPr>
+      <w:r>
+        <w:rPr>
+          <w:sz w:val="20"/>
+          <w:szCs w:val="20"/>
+        </w:rPr>
+        <w:t>El profesor Bit</w:t>
+      </w:r>
+      <w:r>
+        <w:rPr>
+          <w:sz w:val="20"/>
+          <w:szCs w:val="20"/>
+        </w:rPr>
+        <w:t xml:space="preserve"> tiene una tabla hash con </w:t>
+      </w:r>
+      <w:r>
+        <w:rPr>
+          <w:rStyle w:val="Textoennegrita"/>
+          <w:sz w:val="20"/>
+          <w:szCs w:val="20"/>
+        </w:rPr>
+        <w:t>p</w:t>
+      </w:r>
+      <w:r>
+        <w:rPr>
+          <w:sz w:val="20"/>
+          <w:szCs w:val="20"/>
+        </w:rPr>
+        <w:t xml:space="preserve"> casillas, numeradas desde </w:t>
+      </w:r>
+      <w:r>
+        <w:rPr>
+          <w:rStyle w:val="Textoennegrita"/>
+          <w:sz w:val="20"/>
+          <w:szCs w:val="20"/>
+        </w:rPr>
+        <w:t>0</w:t>
+      </w:r>
+      <w:r>
+        <w:rPr>
+          <w:sz w:val="20"/>
+          <w:szCs w:val="20"/>
+        </w:rPr>
+        <w:t xml:space="preserve"> hasta </w:t>
+      </w:r>
+      <w:r>
+        <w:rPr>
+          <w:rStyle w:val="Textoennegrita"/>
+          <w:sz w:val="20"/>
+          <w:szCs w:val="20"/>
+        </w:rPr>
+        <w:t>p − 1</w:t>
+      </w:r>
+      <w:r>
+        <w:rPr>
+          <w:sz w:val="20"/>
+          <w:szCs w:val="20"/>
+        </w:rPr>
+        <w:t xml:space="preserve">. Quiere insertar </w:t>
+      </w:r>
+      <w:r>
+        <w:rPr>
+          <w:rStyle w:val="Textoennegrita"/>
+          <w:sz w:val="20"/>
+          <w:szCs w:val="20"/>
+        </w:rPr>
+        <w:t>n</w:t>
+      </w:r>
+      <w:r>
+        <w:rPr>
+          <w:sz w:val="20"/>
+          <w:szCs w:val="20"/>
+        </w:rPr>
+        <w:t xml:space="preserve"> números en la tabla hash, en el mismo orden en que son proporcionados.</w:t>
+      </w:r>
     </w:p>
     <w:p>
       <w:pPr>
@@ -122,14 +194,7 @@
           <w:sz w:val="20"/>
           <w:szCs w:val="20"/>
         </w:rPr>
-        <w:t>Saúl</w:t>
-      </w:r>
-      <w:r>
-        <w:rPr>
-          <w:sz w:val="20"/>
-          <w:szCs w:val="20"/>
-        </w:rPr>
-        <w:t xml:space="preserve"> tiene una tabla hash con </w:t>
+        <w:t xml:space="preserve">Para el </w:t>
       </w:r>
       <w:r>
         <w:rPr>
@@ -137,14 +202,14 @@
           <w:sz w:val="20"/>
           <w:szCs w:val="20"/>
         </w:rPr>
-        <w:t>p</w:t>
-      </w:r>
-      <w:r>
-        <w:rPr>
-          <w:sz w:val="20"/>
-          <w:szCs w:val="20"/>
-        </w:rPr>
-        <w:t xml:space="preserve"> casillas, numeradas desde </w:t>
+        <w:t>i-ésimo</w:t>
+      </w:r>
+      <w:r>
+        <w:rPr>
+          <w:sz w:val="20"/>
+          <w:szCs w:val="20"/>
+        </w:rPr>
+        <w:t xml:space="preserve"> número </w:t>
       </w:r>
       <w:r>
         <w:rPr>
@@ -152,14 +217,35 @@
           <w:sz w:val="20"/>
           <w:szCs w:val="20"/>
         </w:rPr>
-        <w:t>0</w:t>
-      </w:r>
-      <w:r>
-        <w:rPr>
-          <w:sz w:val="20"/>
-          <w:szCs w:val="20"/>
-        </w:rPr>
-        <w:t xml:space="preserve"> hasta </w:t>
+        <w:t>xᵢ</w:t>
+      </w:r>
+      <w:r>
+        <w:rPr>
+          <w:sz w:val="20"/>
+          <w:szCs w:val="20"/>
+        </w:rPr>
+        <w:t xml:space="preserve">, </w:t>
+      </w:r>
+      <w:r>
+        <w:rPr>
+          <w:sz w:val="20"/>
+          <w:szCs w:val="20"/>
+        </w:rPr>
+        <w:t>el profesor Bit</w:t>
+      </w:r>
+      <w:r>
+        <w:rPr>
+          <w:sz w:val="20"/>
+          <w:szCs w:val="20"/>
+        </w:rPr>
+        <w:t xml:space="preserve"> </w:t>
+      </w:r>
+      <w:r>
+        <w:rPr>
+          <w:sz w:val="20"/>
+          <w:szCs w:val="20"/>
+        </w:rPr>
+        <w:t xml:space="preserve">intentará colocarlo en la casilla con número </w:t>
       </w:r>
       <w:r>
         <w:rPr>
@@ -167,14 +253,14 @@
           <w:sz w:val="20"/>
           <w:szCs w:val="20"/>
         </w:rPr>
-        <w:t>p − 1</w:t>
-      </w:r>
-      <w:r>
-        <w:rPr>
-          <w:sz w:val="20"/>
-          <w:szCs w:val="20"/>
-        </w:rPr>
-        <w:t xml:space="preserve">. Quiere insertar </w:t>
+        <w:t>h(xᵢ)</w:t>
+      </w:r>
+      <w:r>
+        <w:rPr>
+          <w:sz w:val="20"/>
+          <w:szCs w:val="20"/>
+        </w:rPr>
+        <w:t xml:space="preserve">, donde </w:t>
       </w:r>
       <w:r>
         <w:rPr>
@@ -182,146 +268,100 @@
           <w:sz w:val="20"/>
           <w:szCs w:val="20"/>
         </w:rPr>
-        <w:t>n</w:t>
-      </w:r>
-      <w:r>
-        <w:rPr>
-          <w:sz w:val="20"/>
-          <w:szCs w:val="20"/>
-        </w:rPr>
-        <w:t xml:space="preserve"> números en la tabla hash, en el mismo orden en que son proporcionados.</w:t>
+        <w:t>h(x)</w:t>
+      </w:r>
+      <w:r>
+        <w:rPr>
+          <w:sz w:val="20"/>
+          <w:szCs w:val="20"/>
+        </w:rPr>
+        <w:t xml:space="preserve"> es la función hash. En este problema se asume que:</w:t>
+      </w:r>
+      <w:r>
+        <w:rPr>
+          <w:sz w:val="20"/>
+          <w:szCs w:val="20"/>
+        </w:rPr>
+        <w:t xml:space="preserve"> </w:t>
       </w:r>
     </w:p>
     <w:p>
       <w:pPr>
         <w:pStyle w:val="NormalWeb"/>
-        <w:rPr>
-          <w:sz w:val="20"/>
-          <w:szCs w:val="20"/>
-        </w:rPr>
-      </w:pPr>
-      <w:r>
-        <w:rPr>
-          <w:sz w:val="20"/>
-          <w:szCs w:val="20"/>
-        </w:rPr>
-        <w:t xml:space="preserve">Para el </w:t>
-      </w:r>
+        <w:ind w:firstLine="708"/>
+        <w:rPr>
+          <w:sz w:val="20"/>
+          <w:szCs w:val="20"/>
+        </w:rPr>
+      </w:pPr>
       <w:r>
         <w:rPr>
           <w:rStyle w:val="Textoennegrita"/>
           <w:sz w:val="20"/>
           <w:szCs w:val="20"/>
         </w:rPr>
-        <w:t>i-</w:t>
-      </w:r>
-      <w:proofErr w:type="spellStart"/>
-      <w:r>
-        <w:rPr>
-          <w:rStyle w:val="Textoennegrita"/>
-          <w:sz w:val="20"/>
-          <w:szCs w:val="20"/>
-        </w:rPr>
-        <w:t>ésimo</w:t>
-      </w:r>
-      <w:proofErr w:type="spellEnd"/>
-      <w:r>
-        <w:rPr>
-          <w:sz w:val="20"/>
-          <w:szCs w:val="20"/>
-        </w:rPr>
-        <w:t xml:space="preserve"> número </w:t>
-      </w:r>
-      <w:r>
-        <w:rPr>
-          <w:rStyle w:val="Textoennegrita"/>
-          <w:sz w:val="20"/>
-          <w:szCs w:val="20"/>
-        </w:rPr>
-        <w:t>xᵢ</w:t>
-      </w:r>
-      <w:r>
-        <w:rPr>
-          <w:sz w:val="20"/>
-          <w:szCs w:val="20"/>
-        </w:rPr>
-        <w:t xml:space="preserve">, </w:t>
-      </w:r>
-      <w:r>
-        <w:rPr>
-          <w:sz w:val="20"/>
-          <w:szCs w:val="20"/>
-        </w:rPr>
-        <w:t>Saúl</w:t>
-      </w:r>
-      <w:r>
-        <w:rPr>
-          <w:sz w:val="20"/>
-          <w:szCs w:val="20"/>
-        </w:rPr>
-        <w:t xml:space="preserve"> </w:t>
-      </w:r>
-      <w:r>
-        <w:rPr>
-          <w:sz w:val="20"/>
-          <w:szCs w:val="20"/>
-        </w:rPr>
-        <w:t xml:space="preserve">intentará colocarlo en la casilla con número </w:t>
-      </w:r>
-      <w:r>
-        <w:rPr>
-          <w:rStyle w:val="Textoennegrita"/>
-          <w:sz w:val="20"/>
-          <w:szCs w:val="20"/>
-        </w:rPr>
-        <w:t>h(xᵢ)</w:t>
-      </w:r>
-      <w:r>
-        <w:rPr>
-          <w:sz w:val="20"/>
-          <w:szCs w:val="20"/>
-        </w:rPr>
-        <w:t xml:space="preserve">, donde </w:t>
-      </w:r>
-      <w:r>
-        <w:rPr>
-          <w:rStyle w:val="Textoennegrita"/>
-          <w:sz w:val="20"/>
-          <w:szCs w:val="20"/>
-        </w:rPr>
-        <w:t>h(x)</w:t>
-      </w:r>
-      <w:r>
-        <w:rPr>
-          <w:sz w:val="20"/>
-          <w:szCs w:val="20"/>
-        </w:rPr>
-        <w:t xml:space="preserve"> es la función hash. En este problema se asume que:</w:t>
-      </w:r>
-      <w:r>
-        <w:rPr>
-          <w:sz w:val="20"/>
-          <w:szCs w:val="20"/>
-        </w:rPr>
-        <w:t xml:space="preserve"> </w:t>
+        <w:t>h(x) = x mod p</w:t>
       </w:r>
     </w:p>
     <w:p>
       <w:pPr>
         <w:pStyle w:val="NormalWeb"/>
-        <w:ind w:firstLine="708"/>
-        <w:rPr>
-          <w:sz w:val="20"/>
-          <w:szCs w:val="20"/>
-        </w:rPr>
-      </w:pPr>
+        <w:rPr>
+          <w:sz w:val="20"/>
+          <w:szCs w:val="20"/>
+        </w:rPr>
+      </w:pPr>
+      <w:r>
+        <w:rPr>
+          <w:sz w:val="20"/>
+          <w:szCs w:val="20"/>
+        </w:rPr>
+        <w:t xml:space="preserve">La operación </w:t>
+      </w:r>
       <w:r>
         <w:rPr>
           <w:rStyle w:val="Textoennegrita"/>
           <w:sz w:val="20"/>
           <w:szCs w:val="20"/>
         </w:rPr>
-        <w:t>h(x) = x mod p</w:t>
+        <w:t>a mod b</w:t>
+      </w:r>
+      <w:r>
+        <w:rPr>
+          <w:sz w:val="20"/>
+          <w:szCs w:val="20"/>
+        </w:rPr>
+        <w:t xml:space="preserve"> representa el residuo de la división de </w:t>
+      </w:r>
+      <w:r>
+        <w:rPr>
+          <w:rStyle w:val="Textoennegrita"/>
+          <w:sz w:val="20"/>
+          <w:szCs w:val="20"/>
+        </w:rPr>
+        <w:t>a</w:t>
+      </w:r>
+      <w:r>
+        <w:rPr>
+          <w:sz w:val="20"/>
+          <w:szCs w:val="20"/>
+        </w:rPr>
+        <w:t xml:space="preserve"> entre </w:t>
+      </w:r>
+      <w:r>
+        <w:rPr>
+          <w:rStyle w:val="Textoennegrita"/>
+          <w:sz w:val="20"/>
+          <w:szCs w:val="20"/>
+        </w:rPr>
+        <w:t>b</w:t>
+      </w:r>
+      <w:r>
+        <w:rPr>
+          <w:sz w:val="20"/>
+          <w:szCs w:val="20"/>
+        </w:rPr>
+        <w:t>.</w:t>
       </w:r>
     </w:p>
     <w:p>
@@ -337,7 +377,28 @@
           <w:sz w:val="20"/>
           <w:szCs w:val="20"/>
         </w:rPr>
-        <w:t xml:space="preserve">La operación </w:t>
+        <w:t xml:space="preserve">Sin embargo, cada casilla puede contener como máximo un elemento. Si </w:t>
+      </w:r>
+      <w:r>
+        <w:rPr>
+          <w:sz w:val="20"/>
+          <w:szCs w:val="20"/>
+        </w:rPr>
+        <w:t>el profesor Bit</w:t>
+      </w:r>
+      <w:r>
+        <w:rPr>
+          <w:sz w:val="20"/>
+          <w:szCs w:val="20"/>
+        </w:rPr>
+        <w:t xml:space="preserve"> </w:t>
+      </w:r>
+      <w:r>
+        <w:rPr>
+          <w:sz w:val="20"/>
+          <w:szCs w:val="20"/>
+        </w:rPr>
+        <w:t xml:space="preserve">intenta insertar un número en una casilla que ya está ocupada, diremos que ocurre un </w:t>
       </w:r>
       <w:r>
         <w:rPr>
@@ -345,37 +406,7 @@
           <w:sz w:val="20"/>
           <w:szCs w:val="20"/>
         </w:rPr>
-        <w:t>a mod b</w:t>
-      </w:r>
-      <w:r>
-        <w:rPr>
-          <w:sz w:val="20"/>
-          <w:szCs w:val="20"/>
-        </w:rPr>
-        <w:t xml:space="preserve"> representa el residuo de la división de </w:t>
-      </w:r>
-      <w:r>
-        <w:rPr>
-          <w:rStyle w:val="Textoennegrita"/>
-          <w:sz w:val="20"/>
-          <w:szCs w:val="20"/>
-        </w:rPr>
-        <w:t>a</w:t>
-      </w:r>
-      <w:r>
-        <w:rPr>
-          <w:sz w:val="20"/>
-          <w:szCs w:val="20"/>
-        </w:rPr>
-        <w:t xml:space="preserve"> entre </w:t>
-      </w:r>
-      <w:r>
-        <w:rPr>
-          <w:rStyle w:val="Textoennegrita"/>
-          <w:sz w:val="20"/>
-          <w:szCs w:val="20"/>
-        </w:rPr>
-        <w:t>b</w:t>
+        <w:t>conflicto</w:t>
       </w:r>
       <w:r>
         <w:rPr>
@@ -398,28 +429,7 @@
           <w:sz w:val="20"/>
           <w:szCs w:val="20"/>
         </w:rPr>
-        <w:t xml:space="preserve">Sin embargo, cada casilla puede contener como máximo un elemento. Si </w:t>
-      </w:r>
-      <w:r>
-        <w:rPr>
-          <w:sz w:val="20"/>
-          <w:szCs w:val="20"/>
-        </w:rPr>
-        <w:t>Saúl</w:t>
-      </w:r>
-      <w:r>
-        <w:rPr>
-          <w:sz w:val="20"/>
-          <w:szCs w:val="20"/>
-        </w:rPr>
-        <w:t xml:space="preserve"> </w:t>
-      </w:r>
-      <w:r>
-        <w:rPr>
-          <w:sz w:val="20"/>
-          <w:szCs w:val="20"/>
-        </w:rPr>
-        <w:t xml:space="preserve">intenta insertar un número en una casilla que ya está ocupada, diremos que ocurre un </w:t>
+        <w:t xml:space="preserve">Supongamos que el primer conflicto ocurre inmediatamente después de la </w:t>
       </w:r>
       <w:r>
         <w:rPr>
@@ -427,56 +437,7 @@
           <w:sz w:val="20"/>
           <w:szCs w:val="20"/>
         </w:rPr>
-        <w:t>conflicto</w:t>
-      </w:r>
-      <w:r>
-        <w:rPr>
-          <w:sz w:val="20"/>
-          <w:szCs w:val="20"/>
-        </w:rPr>
-        <w:t>.</w:t>
-      </w:r>
-    </w:p>
-    <w:p>
-      <w:pPr>
-        <w:pStyle w:val="NormalWeb"/>
-        <w:rPr>
-          <w:sz w:val="20"/>
-          <w:szCs w:val="20"/>
-        </w:rPr>
-      </w:pPr>
-      <w:r>
-        <w:rPr>
-          <w:sz w:val="20"/>
-          <w:szCs w:val="20"/>
-        </w:rPr>
-        <w:t xml:space="preserve">Supongamos que el primer conflicto ocurre inmediatamente después de la </w:t>
-      </w:r>
-      <w:r>
-        <w:rPr>
-          <w:rStyle w:val="Textoennegrita"/>
-          <w:sz w:val="20"/>
-          <w:szCs w:val="20"/>
-        </w:rPr>
-        <w:t>i-</w:t>
-      </w:r>
-      <w:proofErr w:type="spellStart"/>
-      <w:r>
-        <w:rPr>
-          <w:rStyle w:val="Textoennegrita"/>
-          <w:sz w:val="20"/>
-          <w:szCs w:val="20"/>
-        </w:rPr>
-        <w:t>ésima</w:t>
-      </w:r>
-      <w:proofErr w:type="spellEnd"/>
-      <w:r>
-        <w:rPr>
-          <w:rStyle w:val="Textoennegrita"/>
-          <w:sz w:val="20"/>
-          <w:szCs w:val="20"/>
-        </w:rPr>
-        <w:t xml:space="preserve"> inserción</w:t>
+        <w:t>i-ésima inserción</w:t>
       </w:r>
       <w:r>
         <w:rPr>
@@ -628,19 +589,8 @@
           <w:sz w:val="20"/>
           <w:szCs w:val="20"/>
         </w:rPr>
-        <w:t>i-</w:t>
-      </w:r>
-      <w:proofErr w:type="spellStart"/>
-      <w:r>
-        <w:rPr>
-          <w:rStyle w:val="Textoennegrita"/>
-          <w:rFonts w:ascii="Times New Roman" w:hAnsi="Times New Roman" w:cs="Times New Roman"/>
-          <w:sz w:val="20"/>
-          <w:szCs w:val="20"/>
-        </w:rPr>
-        <w:t>ésima</w:t>
-      </w:r>
-      <w:proofErr w:type="spellEnd"/>
+        <w:t>i-ésima</w:t>
+      </w:r>
       <w:r>
         <w:rPr>
           <w:rFonts w:ascii="Times New Roman" w:hAnsi="Times New Roman" w:cs="Times New Roman"/>

</xml_diff>